<commit_message>
Paula Fernandes: revisão da Parte 4
Co-Authored-By: Claude Opus 5.5 <noreply@anthropic.com>
Claude-Session: https://claude.ai/code/session_01MJjUEEZrxQDEUifKK2vj9g
</commit_message>
<xml_diff>
--- a/roteiros/paula-fernandes/Paula_Parte4.docx
+++ b/roteiros/paula-fernandes/Paula_Parte4.docx
@@ -39,7 +39,7 @@
         <w:rPr>
           <w:color w:val="000000"/>
         </w:rPr>
-        <w:t>Roberta estava no Roda Viva, o programa de entrevistas da TV Cultura. Uma bancada de jornalistas em volta, as câmeras girando, o país inteiro assistindo.</w:t>
+        <w:t>Roberta estava no Roda Viva, o programa de entrevistas da TV Cultura. Uma bancada de jornalistas em volta e as perguntas vindo de todos os lados, ao vivo.</w:t>
       </w:r>
     </w:p>
     <w:p>
@@ -71,7 +71,7 @@
         <w:rPr>
           <w:color w:val="000000"/>
         </w:rPr>
-        <w:t>Roberta já tinha falado de Paula antes. Em outra ocasião, ela já tinha dado a entender que a cantora mais nova copiava o jeito dela de se vestir e de falar com o público no palco. Para muitos fãs de Roberta, aquilo era falta de respeito com quem tinha aberto o caminho para as mulheres no sertanejo.</w:t>
+        <w:t>Em outra ocasião, Roberta também deu a entender que a cantora mais nova copiava o jeito dela de se vestir e de falar com o público no palco. Para Roberta, aquilo era uma falta de respeito.</w:t>
       </w:r>
     </w:p>
     <w:p>
@@ -119,7 +119,7 @@
         <w:rPr>
           <w:color w:val="000000"/>
         </w:rPr>
-        <w:t>Era a primeira vez que Paula assumia publicamente uma parte da fama que carregava havia tanto tempo.</w:t>
+        <w:t>Era um jeito diferente de responder a um rótulo que ela carregava havia catorze anos. Em vez de negar tudo, ela assumia a sua parte.</w:t>
       </w:r>
     </w:p>
     <w:p>
@@ -183,7 +183,7 @@
         <w:rPr>
           <w:color w:val="000000"/>
         </w:rPr>
-        <w:t>Começou pelos números.</w:t>
+        <w:t>A reportagem trazia números que mostravam o tamanho do problema.</w:t>
       </w:r>
     </w:p>
     <w:p>
@@ -223,7 +223,7 @@
         <w:rPr>
           <w:color w:val="000000"/>
         </w:rPr>
-        <w:t>Ela falava de verdade, de sentimento real. E, quase sem perceber, estava se preparando para contar a parte mais dura da própria verdade.</w:t>
+        <w:t>Ela falava de verdade e de sentimento real. E aquela mesma entrevista ia trazer a parte mais dura da verdade dela.</w:t>
       </w:r>
     </w:p>
     <w:p>
@@ -359,7 +359,7 @@
         <w:rPr>
           <w:color w:val="1F4EB4"/>
         </w:rPr>
-        <w:t>A cantora que recusava os jantares depois do show. Que preferia descansar no hotel. Que pedia um banheiro no camarim. Para essa mulher, o meio sertanejo reservou dois rótulos ao mesmo tempo.</w:t>
+        <w:t>A cantora que recusava os jantares depois do show e preferia descansar no hotel. Para essa mulher, o meio sertanejo reservou dois rótulos ao mesmo tempo.</w:t>
       </w:r>
     </w:p>
     <w:p>
@@ -391,7 +391,7 @@
         <w:rPr>
           <w:color w:val="1F4EB4"/>
         </w:rPr>
-        <w:t>É por isso que a frase dela sobre aquela época dói tanto. Ela disse que talvez seja real demais. E que não sabe se as pessoas estão preparadas para isso.</w:t>
+        <w:t>É por isso que uma frase dela naquela entrevista pesa tanto. Ela disse que talvez seja real demais. E que não sabe se as pessoas estão preparadas para isso.</w:t>
       </w:r>
     </w:p>
     <w:p>
@@ -423,7 +423,7 @@
         <w:rPr>
           <w:color w:val="C00000"/>
         </w:rPr>
-        <w:t>Mas essa história não termina na escuridão. Porque, dias depois daquela entrevista, Paula voltou a um lugar que ela conhecia muito bem. Um lugar onde, quando era adolescente, ninguém prestava atenção na voz dela. E o que aconteceu ali, na noite do aniversário dela, fecha um círculo que começou numa fazenda sem luz em Sete Lagoas.</w:t>
+        <w:t>Mas essa história não termina na escuridão. Porque, dias depois daquela entrevista, Paula voltou a um lugar que ela conhecia muito bem. Uma arena de rodeio, parecida com aquelas onde, adolescente, ela cantava sem que ninguém prestasse atenção. E o que aconteceu ali, na véspera e na noite do aniversário dela, fecha um círculo que começou numa fazenda sem luz em Sete Lagoas.</w:t>
       </w:r>
     </w:p>
     <w:p>

</xml_diff>